<commit_message>
improved 4c and 5
</commit_message>
<xml_diff>
--- a/hw5 extra credit updates.docx
+++ b/hw5 extra credit updates.docx
@@ -3,9 +3,139 @@
 <w:document xmlns:wpc="http://schemas.microsoft.com/office/word/2010/wordprocessingCanvas" xmlns:cx="http://schemas.microsoft.com/office/drawing/2014/chartex" xmlns:cx1="http://schemas.microsoft.com/office/drawing/2015/9/8/chartex" xmlns:cx2="http://schemas.microsoft.com/office/drawing/2015/10/21/chartex" xmlns:cx3="http://schemas.microsoft.com/office/drawing/2016/5/9/chartex" xmlns:cx4="http://schemas.microsoft.com/office/drawing/2016/5/10/chartex" xmlns:cx5="http://schemas.microsoft.com/office/drawing/2016/5/11/chartex" xmlns:cx6="http://schemas.microsoft.com/office/drawing/2016/5/12/chartex" xmlns:cx7="http://schemas.microsoft.com/office/drawing/2016/5/13/chartex" xmlns:cx8="http://schemas.microsoft.com/office/drawing/2016/5/14/chartex" xmlns:mc="http://schemas.openxmlformats.org/markup-compatibility/2006" xmlns:aink="http://schemas.microsoft.com/office/drawing/2016/ink" xmlns:am3d="http://schemas.microsoft.com/office/drawing/2017/model3d" xmlns:o="urn:schemas-microsoft-com:office:office" xmlns:oel="http://schemas.microsoft.com/office/2019/extlst" xmlns:r="http://schemas.openxmlformats.org/officeDocument/2006/relationships" xmlns:m="http://schemas.openxmlformats.org/officeDocument/2006/math" xmlns:v="urn:schemas-microsoft-com:vml" xmlns:wp14="http://schemas.microsoft.com/office/word/2010/wordprocessingDrawing" xmlns:wp="http://schemas.openxmlformats.org/drawingml/2006/wordprocessingDrawing" xmlns:w10="urn:schemas-microsoft-com:office:word" xmlns:w="http://schemas.openxmlformats.org/wordprocessingml/2006/main" xmlns:w14="http://schemas.microsoft.com/office/word/2010/wordml" xmlns:w15="http://schemas.microsoft.com/office/word/2012/wordml" xmlns:w16cex="http://schemas.microsoft.com/office/word/2018/wordml/cex" xmlns:w16cid="http://schemas.microsoft.com/office/word/2016/wordml/cid" xmlns:w16="http://schemas.microsoft.com/office/word/2018/wordml" xmlns:w16du="http://schemas.microsoft.com/office/word/2023/wordml/word16du" xmlns:w16sdtdh="http://schemas.microsoft.com/office/word/2020/wordml/sdtdatahash" xmlns:w16sdtfl="http://schemas.microsoft.com/office/word/2024/wordml/sdtformatlock" xmlns:w16se="http://schemas.microsoft.com/office/word/2015/wordml/symex" xmlns:wpg="http://schemas.microsoft.com/office/word/2010/wordprocessingGroup" xmlns:wpi="http://schemas.microsoft.com/office/word/2010/wordprocessingInk" xmlns:wne="http://schemas.microsoft.com/office/word/2006/wordml" xmlns:wps="http://schemas.microsoft.com/office/word/2010/wordprocessingShape" mc:Ignorable="w14 w15 w16se w16cid w16 w16cex w16sdtdh w16sdtfl w16du wp14">
   <w:body>
     <w:p>
-      <w:r>
+      <w:pPr>
+        <w:jc w:val="right"/>
+      </w:pPr>
+      <w:r>
+        <w:t>Andrew Centa</w:t>
+      </w:r>
+    </w:p>
+    <w:p>
+      <w:pPr>
+        <w:jc w:val="center"/>
+        <w:rPr>
+          <w:b/>
+          <w:bCs/>
+          <w:u w:val="single"/>
+        </w:rPr>
+      </w:pPr>
+      <w:r>
+        <w:rPr>
+          <w:b/>
+          <w:bCs/>
+          <w:u w:val="single"/>
+        </w:rPr>
         <w:t>HW_5_Extra Credit Completed Item List</w:t>
       </w:r>
+    </w:p>
+    <w:p>
+      <w:pPr>
+        <w:rPr>
+          <w:b/>
+          <w:bCs/>
+          <w:u w:val="single"/>
+        </w:rPr>
+      </w:pPr>
+      <w:r>
+        <w:rPr>
+          <w:b/>
+          <w:bCs/>
+          <w:u w:val="single"/>
+        </w:rPr>
+        <w:t xml:space="preserve">** This submission is intentionally partially completed and should only be assessed as extra credit. I completed homework 4 as my primary submission and then began to work on this in my spare time knowing I would not have enough time to fully complete </w:t>
+      </w:r>
+      <w:proofErr w:type="gramStart"/>
+      <w:r>
+        <w:rPr>
+          <w:b/>
+          <w:bCs/>
+          <w:u w:val="single"/>
+        </w:rPr>
+        <w:t>it.*</w:t>
+      </w:r>
+      <w:proofErr w:type="gramEnd"/>
+      <w:r>
+        <w:rPr>
+          <w:b/>
+          <w:bCs/>
+          <w:u w:val="single"/>
+        </w:rPr>
+        <w:t>**</w:t>
+      </w:r>
+    </w:p>
+    <w:p>
+      <w:pPr>
+        <w:rPr>
+          <w:b/>
+          <w:bCs/>
+          <w:i/>
+          <w:iCs/>
+        </w:rPr>
+      </w:pPr>
+      <w:r>
+        <w:rPr>
+          <w:b/>
+          <w:bCs/>
+          <w:i/>
+          <w:iCs/>
+          <w:highlight w:val="green"/>
+        </w:rPr>
+        <w:t>(</w:t>
+      </w:r>
+      <w:r>
+        <w:rPr>
+          <w:b/>
+          <w:bCs/>
+          <w:i/>
+          <w:iCs/>
+          <w:highlight w:val="green"/>
+        </w:rPr>
+        <w:t xml:space="preserve">(20 points) Update the chicken domain to implement the modified rules, using 4 </w:t>
+      </w:r>
+      <w:proofErr w:type="gramStart"/>
+      <w:r>
+        <w:rPr>
+          <w:b/>
+          <w:bCs/>
+          <w:i/>
+          <w:iCs/>
+          <w:highlight w:val="green"/>
+        </w:rPr>
+        <w:t>coops</w:t>
+      </w:r>
+      <w:proofErr w:type="gramEnd"/>
+      <w:r>
+        <w:rPr>
+          <w:b/>
+          <w:bCs/>
+          <w:i/>
+          <w:iCs/>
+          <w:highlight w:val="green"/>
+        </w:rPr>
+        <w:t>, 64 chickens and 256 tournaments</w:t>
+      </w:r>
+      <w:proofErr w:type="gramStart"/>
+      <w:r>
+        <w:rPr>
+          <w:b/>
+          <w:bCs/>
+          <w:i/>
+          <w:iCs/>
+          <w:highlight w:val="green"/>
+        </w:rPr>
+        <w:t xml:space="preserve">. </w:t>
+      </w:r>
+      <w:r>
+        <w:rPr>
+          <w:b/>
+          <w:bCs/>
+          <w:i/>
+          <w:iCs/>
+          <w:highlight w:val="green"/>
+        </w:rPr>
+        <w:t>)</w:t>
+      </w:r>
+      <w:proofErr w:type="gramEnd"/>
     </w:p>
     <w:p>
       <w:pPr>
@@ -16,7 +146,15 @@
         </w:numPr>
       </w:pPr>
       <w:r>
-        <w:t>Updated input variables so that T = 256 istead of T = 1000</w:t>
+        <w:t xml:space="preserve">Updated input variables so that T = 256 </w:t>
+      </w:r>
+      <w:proofErr w:type="spellStart"/>
+      <w:r>
+        <w:t>istead</w:t>
+      </w:r>
+      <w:proofErr w:type="spellEnd"/>
+      <w:r>
+        <w:t xml:space="preserve"> of T = 1000</w:t>
       </w:r>
     </w:p>
     <w:p>
@@ -40,7 +178,20 @@
         </w:numPr>
       </w:pPr>
       <w:r>
-        <w:t>Updated the “CountCrowns()” function to update the sack component after each tournament</w:t>
+        <w:t>Updated the “</w:t>
+      </w:r>
+      <w:proofErr w:type="spellStart"/>
+      <w:proofErr w:type="gramStart"/>
+      <w:r>
+        <w:t>CountCrowns</w:t>
+      </w:r>
+      <w:proofErr w:type="spellEnd"/>
+      <w:r>
+        <w:t>(</w:t>
+      </w:r>
+      <w:proofErr w:type="gramEnd"/>
+      <w:r>
+        <w:t>)” function to update the sack component after each tournament</w:t>
       </w:r>
     </w:p>
     <w:p>
@@ -52,7 +203,20 @@
         </w:numPr>
       </w:pPr>
       <w:r>
-        <w:t>Created the ShareObservations() and tested that it functions correctly</w:t>
+        <w:t xml:space="preserve">Created the </w:t>
+      </w:r>
+      <w:proofErr w:type="spellStart"/>
+      <w:proofErr w:type="gramStart"/>
+      <w:r>
+        <w:t>ShareObservations</w:t>
+      </w:r>
+      <w:proofErr w:type="spellEnd"/>
+      <w:r>
+        <w:t>(</w:t>
+      </w:r>
+      <w:proofErr w:type="gramEnd"/>
+      <w:r>
+        <w:t>) and tested that it functions correctly</w:t>
       </w:r>
     </w:p>
     <w:p>
@@ -60,10 +224,13 @@
         <w:ind w:left="360"/>
       </w:pPr>
       <w:r>
+        <w:rPr>
+          <w:noProof/>
+        </w:rPr>
         <w:drawing>
-          <wp:inline distT="0" distB="0" distL="0" distR="0" wp14:anchorId="0D3D6E7B" wp14:editId="08C415EA">
-            <wp:extent cx="5315223" cy="2749691"/>
-            <wp:effectExtent l="0" t="0" r="0" b="0"/>
+          <wp:inline distT="0" distB="0" distL="0" distR="0" wp14:anchorId="0D3D6E7B" wp14:editId="19EA4B56">
+            <wp:extent cx="4892634" cy="2531076"/>
+            <wp:effectExtent l="0" t="0" r="3810" b="3175"/>
             <wp:docPr id="1704441889" name="Picture 1"/>
             <wp:cNvGraphicFramePr>
               <a:graphicFrameLocks xmlns:a="http://schemas.openxmlformats.org/drawingml/2006/main" noChangeAspect="1"/>
@@ -84,7 +251,7 @@
                   <pic:spPr>
                     <a:xfrm>
                       <a:off x="0" y="0"/>
-                      <a:ext cx="5315223" cy="2749691"/>
+                      <a:ext cx="4895992" cy="2532813"/>
                     </a:xfrm>
                     <a:prstGeom prst="rect">
                       <a:avLst/>
@@ -106,11 +273,27 @@
         </w:numPr>
       </w:pPr>
       <w:r>
-        <w:t>Created transfercrowns() and tested that it functions correctly</w:t>
-      </w:r>
-    </w:p>
-    <w:p>
-      <w:r>
+        <w:t xml:space="preserve">Created </w:t>
+      </w:r>
+      <w:proofErr w:type="spellStart"/>
+      <w:proofErr w:type="gramStart"/>
+      <w:r>
+        <w:t>transfercrowns</w:t>
+      </w:r>
+      <w:proofErr w:type="spellEnd"/>
+      <w:r>
+        <w:t>(</w:t>
+      </w:r>
+      <w:proofErr w:type="gramEnd"/>
+      <w:r>
+        <w:t>) and tested that it functions correctly</w:t>
+      </w:r>
+    </w:p>
+    <w:p>
+      <w:r>
+        <w:rPr>
+          <w:noProof/>
+        </w:rPr>
         <w:drawing>
           <wp:inline distT="0" distB="0" distL="0" distR="0" wp14:anchorId="69E8DF2F" wp14:editId="25C7018A">
             <wp:extent cx="1657435" cy="1886047"/>
@@ -157,12 +340,48 @@
         </w:numPr>
       </w:pPr>
       <w:r>
-        <w:t>Created ExtendSackOwnership() and tested that it functions correctly</w:t>
-      </w:r>
-    </w:p>
-    <w:p>
-      <w:r>
         <w:lastRenderedPageBreak/>
+        <w:t xml:space="preserve">Added </w:t>
+      </w:r>
+      <w:proofErr w:type="spellStart"/>
+      <w:r>
+        <w:t>sack_owner</w:t>
+      </w:r>
+      <w:proofErr w:type="spellEnd"/>
+      <w:r>
+        <w:t xml:space="preserve"> as a chicken class component to track which chicken are sharing a sack</w:t>
+      </w:r>
+    </w:p>
+    <w:p>
+      <w:pPr>
+        <w:pStyle w:val="ListParagraph"/>
+        <w:numPr>
+          <w:ilvl w:val="0"/>
+          <w:numId w:val="1"/>
+        </w:numPr>
+      </w:pPr>
+      <w:r>
+        <w:t xml:space="preserve">Created </w:t>
+      </w:r>
+      <w:proofErr w:type="spellStart"/>
+      <w:proofErr w:type="gramStart"/>
+      <w:r>
+        <w:t>ExtendSackOwnership</w:t>
+      </w:r>
+      <w:proofErr w:type="spellEnd"/>
+      <w:r>
+        <w:t>(</w:t>
+      </w:r>
+      <w:proofErr w:type="gramEnd"/>
+      <w:r>
+        <w:t>) and tested that it functions correctly</w:t>
+      </w:r>
+    </w:p>
+    <w:p>
+      <w:r>
+        <w:rPr>
+          <w:noProof/>
+        </w:rPr>
         <w:drawing>
           <wp:inline distT="0" distB="0" distL="0" distR="0" wp14:anchorId="10267E6E" wp14:editId="222B3913">
             <wp:extent cx="5943600" cy="2955925"/>
@@ -200,6 +419,315 @@
         </w:drawing>
       </w:r>
     </w:p>
+    <w:p>
+      <w:pPr>
+        <w:pStyle w:val="ListParagraph"/>
+        <w:numPr>
+          <w:ilvl w:val="0"/>
+          <w:numId w:val="1"/>
+        </w:numPr>
+      </w:pPr>
+      <w:r>
+        <w:t xml:space="preserve">Created the function, </w:t>
+      </w:r>
+      <w:proofErr w:type="spellStart"/>
+      <w:proofErr w:type="gramStart"/>
+      <w:r>
+        <w:t>ShareCount</w:t>
+      </w:r>
+      <w:proofErr w:type="spellEnd"/>
+      <w:r>
+        <w:t>(</w:t>
+      </w:r>
+      <w:proofErr w:type="gramEnd"/>
+      <w:r>
+        <w:t>) to consider chickens that have teamed up and tally their crown totals accordingly by adding up all their crowns and diving by the number of chickens on the team</w:t>
+      </w:r>
+    </w:p>
+    <w:p>
+      <w:pPr>
+        <w:pStyle w:val="ListParagraph"/>
+        <w:numPr>
+          <w:ilvl w:val="1"/>
+          <w:numId w:val="1"/>
+        </w:numPr>
+      </w:pPr>
+      <w:r>
+        <w:t>0 and 55 are sharing:</w:t>
+      </w:r>
+    </w:p>
+    <w:p>
+      <w:pPr>
+        <w:pStyle w:val="ListParagraph"/>
+        <w:numPr>
+          <w:ilvl w:val="2"/>
+          <w:numId w:val="1"/>
+        </w:numPr>
+      </w:pPr>
+      <w:r>
+        <w:t xml:space="preserve">Before </w:t>
+      </w:r>
+      <w:proofErr w:type="spellStart"/>
+      <w:proofErr w:type="gramStart"/>
+      <w:r>
+        <w:t>ShareCount</w:t>
+      </w:r>
+      <w:proofErr w:type="spellEnd"/>
+      <w:r>
+        <w:t>(</w:t>
+      </w:r>
+      <w:proofErr w:type="gramEnd"/>
+      <w:r>
+        <w:t>)</w:t>
+      </w:r>
+    </w:p>
+    <w:p>
+      <w:pPr>
+        <w:pStyle w:val="ListParagraph"/>
+        <w:numPr>
+          <w:ilvl w:val="3"/>
+          <w:numId w:val="1"/>
+        </w:numPr>
+      </w:pPr>
+      <w:r>
+        <w:drawing>
+          <wp:inline distT="0" distB="0" distL="0" distR="0" wp14:anchorId="0D0DBE4C" wp14:editId="634A3369">
+            <wp:extent cx="1397072" cy="482625"/>
+            <wp:effectExtent l="0" t="0" r="0" b="0"/>
+            <wp:docPr id="59596792" name="Picture 1"/>
+            <wp:cNvGraphicFramePr>
+              <a:graphicFrameLocks xmlns:a="http://schemas.openxmlformats.org/drawingml/2006/main" noChangeAspect="1"/>
+            </wp:cNvGraphicFramePr>
+            <a:graphic xmlns:a="http://schemas.openxmlformats.org/drawingml/2006/main">
+              <a:graphicData uri="http://schemas.openxmlformats.org/drawingml/2006/picture">
+                <pic:pic xmlns:pic="http://schemas.openxmlformats.org/drawingml/2006/picture">
+                  <pic:nvPicPr>
+                    <pic:cNvPr id="59596792" name=""/>
+                    <pic:cNvPicPr/>
+                  </pic:nvPicPr>
+                  <pic:blipFill>
+                    <a:blip r:embed="rId8"/>
+                    <a:stretch>
+                      <a:fillRect/>
+                    </a:stretch>
+                  </pic:blipFill>
+                  <pic:spPr>
+                    <a:xfrm>
+                      <a:off x="0" y="0"/>
+                      <a:ext cx="1397072" cy="482625"/>
+                    </a:xfrm>
+                    <a:prstGeom prst="rect">
+                      <a:avLst/>
+                    </a:prstGeom>
+                  </pic:spPr>
+                </pic:pic>
+              </a:graphicData>
+            </a:graphic>
+          </wp:inline>
+        </w:drawing>
+      </w:r>
+    </w:p>
+    <w:p>
+      <w:pPr>
+        <w:pStyle w:val="ListParagraph"/>
+        <w:numPr>
+          <w:ilvl w:val="3"/>
+          <w:numId w:val="1"/>
+        </w:numPr>
+      </w:pPr>
+      <w:r>
+        <w:drawing>
+          <wp:inline distT="0" distB="0" distL="0" distR="0" wp14:anchorId="1E379128" wp14:editId="54C87D0E">
+            <wp:extent cx="704886" cy="520727"/>
+            <wp:effectExtent l="0" t="0" r="0" b="0"/>
+            <wp:docPr id="427363336" name="Picture 1"/>
+            <wp:cNvGraphicFramePr>
+              <a:graphicFrameLocks xmlns:a="http://schemas.openxmlformats.org/drawingml/2006/main" noChangeAspect="1"/>
+            </wp:cNvGraphicFramePr>
+            <a:graphic xmlns:a="http://schemas.openxmlformats.org/drawingml/2006/main">
+              <a:graphicData uri="http://schemas.openxmlformats.org/drawingml/2006/picture">
+                <pic:pic xmlns:pic="http://schemas.openxmlformats.org/drawingml/2006/picture">
+                  <pic:nvPicPr>
+                    <pic:cNvPr id="427363336" name=""/>
+                    <pic:cNvPicPr/>
+                  </pic:nvPicPr>
+                  <pic:blipFill>
+                    <a:blip r:embed="rId9"/>
+                    <a:stretch>
+                      <a:fillRect/>
+                    </a:stretch>
+                  </pic:blipFill>
+                  <pic:spPr>
+                    <a:xfrm>
+                      <a:off x="0" y="0"/>
+                      <a:ext cx="704886" cy="520727"/>
+                    </a:xfrm>
+                    <a:prstGeom prst="rect">
+                      <a:avLst/>
+                    </a:prstGeom>
+                  </pic:spPr>
+                </pic:pic>
+              </a:graphicData>
+            </a:graphic>
+          </wp:inline>
+        </w:drawing>
+      </w:r>
+    </w:p>
+    <w:p>
+      <w:pPr>
+        <w:pStyle w:val="ListParagraph"/>
+        <w:numPr>
+          <w:ilvl w:val="2"/>
+          <w:numId w:val="1"/>
+        </w:numPr>
+      </w:pPr>
+      <w:r>
+        <w:t xml:space="preserve">After </w:t>
+      </w:r>
+      <w:proofErr w:type="spellStart"/>
+      <w:proofErr w:type="gramStart"/>
+      <w:r>
+        <w:t>ShareCount</w:t>
+      </w:r>
+      <w:proofErr w:type="spellEnd"/>
+      <w:r>
+        <w:t>(</w:t>
+      </w:r>
+      <w:proofErr w:type="gramEnd"/>
+      <w:r>
+        <w:t>)</w:t>
+      </w:r>
+    </w:p>
+    <w:p>
+      <w:pPr>
+        <w:pStyle w:val="ListParagraph"/>
+        <w:numPr>
+          <w:ilvl w:val="3"/>
+          <w:numId w:val="1"/>
+        </w:numPr>
+      </w:pPr>
+      <w:r>
+        <w:drawing>
+          <wp:inline distT="0" distB="0" distL="0" distR="0" wp14:anchorId="154BB6D4" wp14:editId="14B1B1D8">
+            <wp:extent cx="1378021" cy="577880"/>
+            <wp:effectExtent l="0" t="0" r="0" b="0"/>
+            <wp:docPr id="2044358377" name="Picture 1"/>
+            <wp:cNvGraphicFramePr>
+              <a:graphicFrameLocks xmlns:a="http://schemas.openxmlformats.org/drawingml/2006/main" noChangeAspect="1"/>
+            </wp:cNvGraphicFramePr>
+            <a:graphic xmlns:a="http://schemas.openxmlformats.org/drawingml/2006/main">
+              <a:graphicData uri="http://schemas.openxmlformats.org/drawingml/2006/picture">
+                <pic:pic xmlns:pic="http://schemas.openxmlformats.org/drawingml/2006/picture">
+                  <pic:nvPicPr>
+                    <pic:cNvPr id="2044358377" name=""/>
+                    <pic:cNvPicPr/>
+                  </pic:nvPicPr>
+                  <pic:blipFill>
+                    <a:blip r:embed="rId10"/>
+                    <a:stretch>
+                      <a:fillRect/>
+                    </a:stretch>
+                  </pic:blipFill>
+                  <pic:spPr>
+                    <a:xfrm>
+                      <a:off x="0" y="0"/>
+                      <a:ext cx="1378021" cy="577880"/>
+                    </a:xfrm>
+                    <a:prstGeom prst="rect">
+                      <a:avLst/>
+                    </a:prstGeom>
+                  </pic:spPr>
+                </pic:pic>
+              </a:graphicData>
+            </a:graphic>
+          </wp:inline>
+        </w:drawing>
+      </w:r>
+    </w:p>
+    <w:p>
+      <w:pPr>
+        <w:pStyle w:val="ListParagraph"/>
+        <w:numPr>
+          <w:ilvl w:val="3"/>
+          <w:numId w:val="1"/>
+        </w:numPr>
+      </w:pPr>
+      <w:r>
+        <w:drawing>
+          <wp:inline distT="0" distB="0" distL="0" distR="0" wp14:anchorId="39DC4296" wp14:editId="51F336F4">
+            <wp:extent cx="635033" cy="615982"/>
+            <wp:effectExtent l="0" t="0" r="0" b="0"/>
+            <wp:docPr id="1567480954" name="Picture 1"/>
+            <wp:cNvGraphicFramePr>
+              <a:graphicFrameLocks xmlns:a="http://schemas.openxmlformats.org/drawingml/2006/main" noChangeAspect="1"/>
+            </wp:cNvGraphicFramePr>
+            <a:graphic xmlns:a="http://schemas.openxmlformats.org/drawingml/2006/main">
+              <a:graphicData uri="http://schemas.openxmlformats.org/drawingml/2006/picture">
+                <pic:pic xmlns:pic="http://schemas.openxmlformats.org/drawingml/2006/picture">
+                  <pic:nvPicPr>
+                    <pic:cNvPr id="1567480954" name=""/>
+                    <pic:cNvPicPr/>
+                  </pic:nvPicPr>
+                  <pic:blipFill>
+                    <a:blip r:embed="rId11"/>
+                    <a:stretch>
+                      <a:fillRect/>
+                    </a:stretch>
+                  </pic:blipFill>
+                  <pic:spPr>
+                    <a:xfrm>
+                      <a:off x="0" y="0"/>
+                      <a:ext cx="635033" cy="615982"/>
+                    </a:xfrm>
+                    <a:prstGeom prst="rect">
+                      <a:avLst/>
+                    </a:prstGeom>
+                  </pic:spPr>
+                </pic:pic>
+              </a:graphicData>
+            </a:graphic>
+          </wp:inline>
+        </w:drawing>
+      </w:r>
+    </w:p>
+    <w:p/>
+    <w:p>
+      <w:pPr>
+        <w:rPr>
+          <w:highlight w:val="green"/>
+        </w:rPr>
+      </w:pPr>
+    </w:p>
+    <w:p>
+      <w:pPr>
+        <w:rPr>
+          <w:highlight w:val="green"/>
+        </w:rPr>
+      </w:pPr>
+    </w:p>
+    <w:p>
+      <w:r>
+        <w:rPr>
+          <w:highlight w:val="green"/>
+        </w:rPr>
+        <w:t>(10 points) Implement NPCs (</w:t>
+      </w:r>
+      <w:proofErr w:type="gramStart"/>
+      <w:r>
+        <w:rPr>
+          <w:highlight w:val="green"/>
+        </w:rPr>
+        <w:t>Non-player</w:t>
+      </w:r>
+      <w:proofErr w:type="gramEnd"/>
+      <w:r>
+        <w:rPr>
+          <w:highlight w:val="green"/>
+        </w:rPr>
+        <w:t xml:space="preserve"> chickens) that execute a simple strategy of moving to the coop where they have highest ability. These chickens do not use the new actions.  There will be 56 NPCs.</w:t>
+      </w:r>
+    </w:p>
+    <w:p/>
     <w:sectPr>
       <w:pgSz w:w="12240" w:h="15840"/>
       <w:pgMar w:top="1440" w:right="1440" w:bottom="1440" w:left="1440" w:header="720" w:footer="720" w:gutter="0"/>
@@ -227,7 +755,7 @@
         <w:rFonts w:ascii="Aptos" w:eastAsiaTheme="minorHAnsi" w:hAnsi="Aptos" w:cstheme="minorBidi" w:hint="default"/>
       </w:rPr>
     </w:lvl>
-    <w:lvl w:ilvl="1" w:tplc="04090003" w:tentative="1">
+    <w:lvl w:ilvl="1" w:tplc="04090003">
       <w:start w:val="1"/>
       <w:numFmt w:val="bullet"/>
       <w:lvlText w:val="o"/>
@@ -239,7 +767,7 @@
         <w:rFonts w:ascii="Courier New" w:hAnsi="Courier New" w:cs="Courier New" w:hint="default"/>
       </w:rPr>
     </w:lvl>
-    <w:lvl w:ilvl="2" w:tplc="04090005" w:tentative="1">
+    <w:lvl w:ilvl="2" w:tplc="04090005">
       <w:start w:val="1"/>
       <w:numFmt w:val="bullet"/>
       <w:lvlText w:val=""/>
@@ -251,7 +779,7 @@
         <w:rFonts w:ascii="Wingdings" w:hAnsi="Wingdings" w:hint="default"/>
       </w:rPr>
     </w:lvl>
-    <w:lvl w:ilvl="3" w:tplc="04090001" w:tentative="1">
+    <w:lvl w:ilvl="3" w:tplc="04090001">
       <w:start w:val="1"/>
       <w:numFmt w:val="bullet"/>
       <w:lvlText w:val=""/>
@@ -933,7 +1461,6 @@
   <w:style w:type="character" w:default="1" w:styleId="DefaultParagraphFont">
     <w:name w:val="Default Paragraph Font"/>
     <w:uiPriority w:val="1"/>
-    <w:semiHidden/>
     <w:unhideWhenUsed/>
   </w:style>
   <w:style w:type="table" w:default="1" w:styleId="TableNormal">

</xml_diff>